<commit_message>
Deploying to gh-pages from @ Morrison-Lab/win@daef7a50f32c4aac8d88f59be649217962100f26 🚀
</commit_message>
<xml_diff>
--- a/chapters/20-treatment-confounder-feedback.docx
+++ b/chapters/20-treatment-confounder-feedback.docx
@@ -5666,29 +5666,27 @@
     <w:tbl>
       <w:tblPr>
         <w:tblStyle w:val="Table"/>
-        <w:tblLook w:firstRow="0" w:lastRow="0" w:firstColumn="0" w:lastColumn="0" w:noHBand="0" w:noVBand="0" w:val="0000"/>
+        <w:tblInd w:w="164" w:type="dxa"/>
         <w:tblBorders>
-          <w:top w:val="single" w:sz="4" w:space="0" w:color="909090"/>
           <w:left w:val="single" w:sz="24" w:space="0" w:color="909090"/>
-          <w:bottom w:val="single" w:sz="4" w:space="0" w:color="909090"/>
-          <w:right w:val="single" w:sz="4" w:space="0" w:color="909090"/>
         </w:tblBorders>
         <w:tblCellMar>
-          <w:left w:w="144" w:type="dxa"/>
-          <w:right w:w="144" w:type="dxa"/>
+          <w:left w:w="0" w:type="dxa"/>
+          <w:right w:w="0" w:type="dxa"/>
         </w:tblCellMar>
         <w:tblLook w:firstRow="0" w:lastRow="0" w:firstColumn="0" w:lastColumn="0" w:noHBand="0" w:noVBand="0" w:val="0000"/>
       </w:tblPr>
+      <w:tblGrid>
+        <w:gridCol w:w="7920"/>
+      </w:tblGrid>
       <w:tr>
         <w:trPr>
           <w:cantSplit/>
         </w:trPr>
         <w:tc>
           <w:tcPr>
-            <w:shd w:color="auto" w:fill="e6e6e6" w:val="clear"/>
             <w:tcMar>
-              <w:top w:w="92" w:type="dxa"/>
-              <w:bottom w:w="92" w:type="dxa"/>
+              <w:left w:w="144" w:type="dxa"/>
             </w:tcMar>
           </w:tcPr>
           <w:p>
@@ -5696,25 +5694,9 @@
               <w:pStyle w:val="BodyText"/>
             </w:pPr>
             <w:pPr>
-              <w:spacing w:before="16" w:after="16"/>
+              <w:spacing w:before="16" w:after="64"/>
             </w:pPr>
-            <w:r>
-              <w:t xml:space="preserve">Remark (Adjusting for Past Treatment in Regression)</w:t>
-            </w:r>
           </w:p>
-        </w:tc>
-      </w:tr>
-      <w:tr>
-        <w:trPr>
-          <w:cantSplit/>
-        </w:trPr>
-        <w:tc>
-          <w:tcPr>
-            <w:tcMar>
-              <w:top w:w="108" w:type="dxa"/>
-              <w:bottom w:w="108" w:type="dxa"/>
-            </w:tcMar>
-          </w:tcPr>
           <w:bookmarkStart w:id="24" w:name="rem-past-treatment-regression"/>
           <w:p>
             <w:pPr>
@@ -6061,7 +6043,6 @@
             </w:r>
           </w:p>
           <w:bookmarkEnd w:id="24"/>
-          <w:p/>
         </w:tc>
       </w:tr>
     </w:tbl>

</xml_diff>